<commit_message>
docs(report): flag Heidelberg case for mandatory anonymization before external release
Names are intentionally left intact for internal review, but the requirement
to anonymize before any external distribution is now loud and unmissable in
every format — cover draft-bar, the §6 case study, and the §9 note — via a new
red .flag style (PDF/print HTML) and flagPara helper (docx), plus bold ⚠
blockquotes in the manuscript and a loud README open-item.

Scoped to the confidential RFP engagement only; the separate §6 mention of
Heidelberg's public Maas Group acquisition is noted as a public M&A fact that
does not need anonymizing. Regenerated PDF + docx.

Co-Authored-By: Claude Opus 4.8 (1M context) <noreply@anthropic.com>
</commit_message>
<xml_diff>
--- a/knowledge-base/outputs/h1-2026-prep/H1_2026_Report_DRAFT.docx
+++ b/knowledge-base/outputs/h1-2026-prep/H1_2026_Report_DRAFT.docx
@@ -47,7 +47,7 @@
         <w:spacing w:after="300"/>
         <w:jc w:val="left"/>
       </w:pPr>
-      <w:hyperlink w:history="1" r:id="rIdqczmynihgoxammo90nlmm">
+      <w:hyperlink w:history="1" r:id="rIddp3ekpucfi_yzs-ws5ymc">
         <w:r>
           <w:rPr>
             <w:rFonts w:ascii="Arial" w:cs="Arial" w:eastAsia="Arial" w:hAnsi="Arial"/>
@@ -2411,7 +2411,41 @@
           <w:sz w:val="18"/>
           <w:szCs w:val="18"/>
         </w:rPr>
-        <w:t xml:space="preserve">  (confirm client-disclosure permission before naming)</w:t>
+        <w:t xml:space="preserve">  (real AV engagement — see anonymization flag below)</w:t>
+      </w:r>
+    </w:p>
+    <w:p>
+      <w:pPr>
+        <w:pBdr>
+          <w:top w:val="single" w:color="C0392B" w:sz="12" w:space="4"/>
+          <w:bottom w:val="single" w:color="C0392B" w:sz="12" w:space="4"/>
+          <w:left w:val="single" w:color="C0392B" w:sz="18" w:space="6"/>
+          <w:right w:val="single" w:color="C0392B" w:sz="12" w:space="4"/>
+        </w:pBdr>
+        <w:shd w:color="FDECEA" w:val="solid"/>
+        <w:spacing w:after="160" w:before="120"/>
+      </w:pPr>
+      <w:r>
+        <w:rPr>
+          <w:rFonts w:ascii="Arial" w:cs="Arial" w:eastAsia="Arial" w:hAnsi="Arial"/>
+          <w:b/>
+          <w:bCs/>
+          <w:color w:val="C0392B"/>
+          <w:sz w:val="22"/>
+          <w:szCs w:val="22"/>
+        </w:rPr>
+        <w:t xml:space="preserve">⚠ PRE-PUBLICATION — MUST ANONYMIZE BEFORE EXTERNAL RELEASE.  </w:t>
+      </w:r>
+      <w:r>
+        <w:rPr>
+          <w:rFonts w:ascii="Arial" w:cs="Arial" w:eastAsia="Arial" w:hAnsi="Arial"/>
+          <w:b/>
+          <w:bCs/>
+          <w:color w:val="922B21"/>
+          <w:sz w:val="21"/>
+          <w:szCs w:val="21"/>
+        </w:rPr>
+        <w:t xml:space="preserve">This case study names Heidelberg Materials. Do not distribute externally until client-disclosure permission is confirmed; otherwise replace "Heidelberg Materials" with "a top-three global cement producer" here and in §9. Internal review draft only.</w:t>
       </w:r>
     </w:p>
     <w:p>
@@ -5230,9 +5264,12 @@
     <w:p>
       <w:pPr>
         <w:pBdr>
-          <w:left w:val="single" w:color="215D44" w:sz="18" w:space="6"/>
+          <w:top w:val="single" w:color="C0392B" w:sz="12" w:space="4"/>
+          <w:bottom w:val="single" w:color="C0392B" w:sz="12" w:space="4"/>
+          <w:left w:val="single" w:color="C0392B" w:sz="18" w:space="6"/>
+          <w:right w:val="single" w:color="C0392B" w:sz="12" w:space="4"/>
         </w:pBdr>
-        <w:shd w:color="E0F4EB" w:val="solid"/>
+        <w:shd w:color="FDECEA" w:val="solid"/>
         <w:spacing w:after="160" w:before="120"/>
       </w:pPr>
       <w:r>
@@ -5240,21 +5277,22 @@
           <w:rFonts w:ascii="Arial" w:cs="Arial" w:eastAsia="Arial" w:hAnsi="Arial"/>
           <w:b/>
           <w:bCs/>
-          <w:color w:val="163E2D"/>
+          <w:color w:val="C0392B"/>
           <w:sz w:val="22"/>
           <w:szCs w:val="22"/>
         </w:rPr>
-        <w:t xml:space="preserve">Note:  </w:t>
-      </w:r>
-      <w:r>
-        <w:rPr>
-          <w:rFonts w:ascii="Arial" w:cs="Arial" w:eastAsia="Arial" w:hAnsi="Arial"/>
-          <w:i/>
-          <w:iCs/>
-          <w:sz w:val="22"/>
-          <w:szCs w:val="22"/>
-        </w:rPr>
-        <w:t xml:space="preserve">The engagements above are real Applied Value cases from the AV case-study database, anonymized where required. Confirm client-disclosure permissions (for example, naming Heidelberg Materials) and final figures before publication.</w:t>
+        <w:t xml:space="preserve">⚠ PRE-PUBLICATION — MUST ANONYMIZE BEFORE EXTERNAL RELEASE.  </w:t>
+      </w:r>
+      <w:r>
+        <w:rPr>
+          <w:rFonts w:ascii="Arial" w:cs="Arial" w:eastAsia="Arial" w:hAnsi="Arial"/>
+          <w:b/>
+          <w:bCs/>
+          <w:color w:val="922B21"/>
+          <w:sz w:val="21"/>
+          <w:szCs w:val="21"/>
+        </w:rPr>
+        <w:t xml:space="preserve">The engagements above are real Applied Value cases. The procurement-leverage case names Heidelberg Materials (see §6). Before external release, confirm client-disclosure permission or replace with "a top-three global cement producer." Also confirm final figures. Internal review draft only.</w:t>
       </w:r>
     </w:p>
     <w:p>

</xml_diff>

<commit_message>
docs(report): de-anonymize all four case studies for internal validation
Per Glean source-tracing, the four AV case studies now name their real clients
so they can be validated against source decks (to be re-anonymized before any
external release):
- §4③ Steel directed-buy -> Array Technologies (tentative match)
- §5 New-segment GTM -> ASSA ABLOY (case 414-01-1)
- §6 Procurement leverage -> Heidelberg Materials (777-01-1, Nate Cory)
- §6 Post-deal value -> Piab (an IT-vendor outsourcing negotiation)

Figures left unchanged but flagged for verification: Heidelberg
$2.8M/$7.5M/$150.9M (source decks show $5.75M/$6.0M) and steel $79-114/ST,
±$26M (not traced to a source deck). Widened the red pre-publication
"MUST ANONYMIZE BEFORE EXTERNAL RELEASE" flag (cover, §4③/§5/§6, §9) to cover
all four clients plus the two figure caveats. Applied to manuscript, print
HTML, and docx; regenerated PDF + docx.

Co-Authored-By: Claude Opus 4.8 (1M context) <noreply@anthropic.com>
</commit_message>
<xml_diff>
--- a/knowledge-base/outputs/h1-2026-prep/H1_2026_Report_DRAFT.docx
+++ b/knowledge-base/outputs/h1-2026-prep/H1_2026_Report_DRAFT.docx
@@ -47,7 +47,7 @@
         <w:spacing w:after="300"/>
         <w:jc w:val="left"/>
       </w:pPr>
-      <w:hyperlink w:history="1" r:id="rIddp3ekpucfi_yzs-ws5ymc">
+      <w:hyperlink w:history="1" r:id="rIdugpqx0x8qqeac3gvmvaso">
         <w:r>
           <w:rPr>
             <w:rFonts w:ascii="Arial" w:cs="Arial" w:eastAsia="Arial" w:hAnsi="Arial"/>
@@ -1167,7 +1167,7 @@
           <w:sz w:val="21"/>
           <w:szCs w:val="21"/>
         </w:rPr>
-        <w:t xml:space="preserve">For a manufacturer facing elevated commodity volatility, AV assessed steel-sourcing maturity against best-in-class and benchmarked spend across its network of 27+ mill and service-center relationships, then quantified a roadmap: $79–114/ST in steel-cost reduction by consolidating flat steel onto a directed-buy program, a further $20–40/ST by reshaping the sourcing footprint, and up to ±$26M in gross-margin-variance reduction through indexation.</w:t>
+        <w:t xml:space="preserve">For Array Technologies, AV assessed steel-sourcing maturity against best-in-class and benchmarked spend across its network of 27+ mill and service-center relationships, then quantified a roadmap: $79–114/ST in steel-cost reduction by consolidating flat steel onto a directed-buy program, a further $20–40/ST by reshaping the sourcing footprint, and up to ±$26M in gross-margin-variance reduction through indexation.</w:t>
       </w:r>
       <w:r>
         <w:rPr>
@@ -1178,7 +1178,7 @@
           <w:sz w:val="18"/>
           <w:szCs w:val="18"/>
         </w:rPr>
-        <w:t xml:space="preserve">  (real AV engagement, anonymized)</w:t>
+        <w:t xml:space="preserve">  (real AV engagement — client + figures to confirm)</w:t>
       </w:r>
     </w:p>
     <w:p>
@@ -1566,7 +1566,7 @@
           <w:sz w:val="21"/>
           <w:szCs w:val="21"/>
         </w:rPr>
-        <w:t xml:space="preserve">For a building-products manufacturer targeting a new, higher-value end-user segment, AV built a go-to-market strategy segment-by-segment: mapping the buying center, criteria, and process; defining the sales-rep profile and value-added support model; and producing a sized market-opportunity assessment and roll-out plan. The same playbook applies directly to capturing data-center demand: identify the highest-value programs, then build the commercial readiness to win them.</w:t>
+        <w:t xml:space="preserve">For ASSA ABLOY, targeting a new, higher-value end-user segment, AV built a go-to-market strategy segment-by-segment: mapping the buying center, criteria, and process; defining the sales-rep profile and value-added support model; and producing a sized market-opportunity assessment and roll-out plan. The same playbook applies directly to capturing data-center demand: identify the highest-value programs, then build the commercial readiness to win them.</w:t>
       </w:r>
       <w:r>
         <w:rPr>
@@ -2445,7 +2445,7 @@
           <w:sz w:val="21"/>
           <w:szCs w:val="21"/>
         </w:rPr>
-        <w:t xml:space="preserve">This case study names Heidelberg Materials. Do not distribute externally until client-disclosure permission is confirmed; otherwise replace "Heidelberg Materials" with "a top-three global cement producer" here and in §9. Internal review draft only.</w:t>
+        <w:t xml:space="preserve">This section names real clients — Heidelberg Materials (procurement leverage) and Piab (post-deal value creation). Do not distribute externally until client-disclosure permission is confirmed; otherwise anonymize (e.g., "a top-three global cement producer"). Also verify the Heidelberg figures: source decks show $5.75M/$6.0M variants, not the $2.8M/$7.5M/$150.9M shown here. Internal review draft only.</w:t>
       </w:r>
     </w:p>
     <w:p>
@@ -2473,7 +2473,7 @@
           <w:sz w:val="21"/>
           <w:szCs w:val="21"/>
         </w:rPr>
-        <w:t xml:space="preserve">For a private-equity-owned industrial business, AV led commercial supplier negotiations to drive post-deal value: harmonizing competing quotes onto a like-for-like basis, building fact-based negotiation materials, and running multiple rounds, resulting in a &gt;20% reduction in prices.</w:t>
+        <w:t xml:space="preserve">For Piab, a private-equity-owned industrial business, AV led commercial supplier negotiations to drive post-deal value: harmonizing competing quotes onto a like-for-like basis, building fact-based negotiation materials, and running multiple rounds, resulting in a &gt;20% reduction in prices.</w:t>
       </w:r>
       <w:r>
         <w:rPr>
@@ -2484,7 +2484,7 @@
           <w:sz w:val="18"/>
           <w:szCs w:val="18"/>
         </w:rPr>
-        <w:t xml:space="preserve">  (real AV engagement, anonymized)</w:t>
+        <w:t xml:space="preserve">  (real AV engagement (IT-vendor outsourcing negotiation))</w:t>
       </w:r>
     </w:p>
     <w:p>
@@ -5204,7 +5204,7 @@
           <w:sz w:val="24"/>
           <w:szCs w:val="24"/>
         </w:rPr>
-        <w:t xml:space="preserve">Steel cost &amp; commodity-volatility mitigation (see §4) — directed-buy and indexation roadmap; $79–114/ST steel-cost reduction and up to ±$26M margin-variance reduction.</w:t>
+        <w:t xml:space="preserve">Steel cost &amp; commodity-volatility mitigation (see §4) — Array Technologies; directed-buy and indexation roadmap; $79–114/ST steel-cost reduction and up to ±$26M margin-variance reduction.</w:t>
       </w:r>
     </w:p>
     <w:p>
@@ -5222,7 +5222,7 @@
           <w:sz w:val="24"/>
           <w:szCs w:val="24"/>
         </w:rPr>
-        <w:t xml:space="preserve">New-segment growth capture (see §5) — go-to-market strategy by end-user segment for a building-products manufacturer; sized market opportunity and roll-out plan.</w:t>
+        <w:t xml:space="preserve">New-segment growth capture (see §5) — ASSA ABLOY; go-to-market strategy by end-user segment; sized market opportunity and roll-out plan.</w:t>
       </w:r>
     </w:p>
     <w:p>
@@ -5258,7 +5258,7 @@
           <w:sz w:val="24"/>
           <w:szCs w:val="24"/>
         </w:rPr>
-        <w:t xml:space="preserve">Post-deal value creation (see §6) — fact-based supplier negotiations for a PE-owned industrial; &gt;20% price reduction.</w:t>
+        <w:t xml:space="preserve">Post-deal value creation (see §6) — Piab; fact-based supplier negotiations for a PE-owned industrial; &gt;20% price reduction.</w:t>
       </w:r>
     </w:p>
     <w:p>
@@ -5292,7 +5292,7 @@
           <w:sz w:val="21"/>
           <w:szCs w:val="21"/>
         </w:rPr>
-        <w:t xml:space="preserve">The engagements above are real Applied Value cases. The procurement-leverage case names Heidelberg Materials (see §6). Before external release, confirm client-disclosure permission or replace with "a top-three global cement producer." Also confirm final figures. Internal review draft only.</w:t>
+        <w:t xml:space="preserve">All four case studies above name real clients — Array Technologies (§4), ASSA ABLOY (§5), Heidelberg Materials (§6), and Piab (§6). Anonymize every one before any external release (confirm client-disclosure permission or use a sector descriptor). Two items still need verification: the Heidelberg figures ($2.8M/$7.5M/$150.9M — source decks show $5.75M/$6.0M variants) and the steel figures ($79–114/ST, ±$26M — not yet traced to a source deck; Array Technologies is a tentative match). Internal review draft only.</w:t>
       </w:r>
     </w:p>
     <w:p>

</xml_diff>

<commit_message>
docs(report): explicit anonymization flag at every named case (§4③, §5)
Previously only §6 and §9 had an inline "MUST ANONYMIZE" flag; the §4③
(Array Technologies) and §5 (ASSA ABLOY) cases were covered only by the cover
and §9 flags. Added an adjacent red flag at each so every named client is
explicitly marked for anonymization before the external push. Also fixed two
stale "(...anonymized)" source notes that contradicted the now-named cases.

Every named case is now flagged in-document: cover bar, §4③, §5, §6
(Heidelberg + Piab), and §9. Regenerated PDF + docx.

Co-Authored-By: Claude Opus 4.8 (1M context) <noreply@anthropic.com>
</commit_message>
<xml_diff>
--- a/knowledge-base/outputs/h1-2026-prep/H1_2026_Report_DRAFT.docx
+++ b/knowledge-base/outputs/h1-2026-prep/H1_2026_Report_DRAFT.docx
@@ -47,7 +47,7 @@
         <w:spacing w:after="300"/>
         <w:jc w:val="left"/>
       </w:pPr>
-      <w:hyperlink w:history="1" r:id="rIdugpqx0x8qqeac3gvmvaso">
+      <w:hyperlink w:history="1" r:id="rIdfx29ofawos9nbdmlb3c6k">
         <w:r>
           <w:rPr>
             <w:rFonts w:ascii="Arial" w:cs="Arial" w:eastAsia="Arial" w:hAnsi="Arial"/>
@@ -1178,7 +1178,41 @@
           <w:sz w:val="18"/>
           <w:szCs w:val="18"/>
         </w:rPr>
-        <w:t xml:space="preserve">  (real AV engagement — client + figures to confirm)</w:t>
+        <w:t xml:space="preserve">  (real AV engagement)</w:t>
+      </w:r>
+    </w:p>
+    <w:p>
+      <w:pPr>
+        <w:pBdr>
+          <w:top w:val="single" w:color="C0392B" w:sz="12" w:space="4"/>
+          <w:bottom w:val="single" w:color="C0392B" w:sz="12" w:space="4"/>
+          <w:left w:val="single" w:color="C0392B" w:sz="18" w:space="6"/>
+          <w:right w:val="single" w:color="C0392B" w:sz="12" w:space="4"/>
+        </w:pBdr>
+        <w:shd w:color="FDECEA" w:val="solid"/>
+        <w:spacing w:after="160" w:before="120"/>
+      </w:pPr>
+      <w:r>
+        <w:rPr>
+          <w:rFonts w:ascii="Arial" w:cs="Arial" w:eastAsia="Arial" w:hAnsi="Arial"/>
+          <w:b/>
+          <w:bCs/>
+          <w:color w:val="C0392B"/>
+          <w:sz w:val="22"/>
+          <w:szCs w:val="22"/>
+        </w:rPr>
+        <w:t xml:space="preserve">⚠ PRE-PUBLICATION — MUST ANONYMIZE BEFORE EXTERNAL RELEASE.  </w:t>
+      </w:r>
+      <w:r>
+        <w:rPr>
+          <w:rFonts w:ascii="Arial" w:cs="Arial" w:eastAsia="Arial" w:hAnsi="Arial"/>
+          <w:b/>
+          <w:bCs/>
+          <w:color w:val="922B21"/>
+          <w:sz w:val="21"/>
+          <w:szCs w:val="21"/>
+        </w:rPr>
+        <w:t xml:space="preserve">Names Array Technologies (client match tentative). Before external release, confirm client-disclosure permission or anonymize (e.g., "a steel-intensive equipment manufacturer"). The $79–114/ST and ±$26M figures are not yet traced to a source deck — verify before use. Internal review draft only.</w:t>
       </w:r>
     </w:p>
     <w:p>
@@ -1577,7 +1611,41 @@
           <w:sz w:val="18"/>
           <w:szCs w:val="18"/>
         </w:rPr>
-        <w:t xml:space="preserve">  (real AV engagement, anonymized)</w:t>
+        <w:t xml:space="preserve">  (real AV engagement)</w:t>
+      </w:r>
+    </w:p>
+    <w:p>
+      <w:pPr>
+        <w:pBdr>
+          <w:top w:val="single" w:color="C0392B" w:sz="12" w:space="4"/>
+          <w:bottom w:val="single" w:color="C0392B" w:sz="12" w:space="4"/>
+          <w:left w:val="single" w:color="C0392B" w:sz="18" w:space="6"/>
+          <w:right w:val="single" w:color="C0392B" w:sz="12" w:space="4"/>
+        </w:pBdr>
+        <w:shd w:color="FDECEA" w:val="solid"/>
+        <w:spacing w:after="160" w:before="120"/>
+      </w:pPr>
+      <w:r>
+        <w:rPr>
+          <w:rFonts w:ascii="Arial" w:cs="Arial" w:eastAsia="Arial" w:hAnsi="Arial"/>
+          <w:b/>
+          <w:bCs/>
+          <w:color w:val="C0392B"/>
+          <w:sz w:val="22"/>
+          <w:szCs w:val="22"/>
+        </w:rPr>
+        <w:t xml:space="preserve">⚠ PRE-PUBLICATION — MUST ANONYMIZE BEFORE EXTERNAL RELEASE.  </w:t>
+      </w:r>
+      <w:r>
+        <w:rPr>
+          <w:rFonts w:ascii="Arial" w:cs="Arial" w:eastAsia="Arial" w:hAnsi="Arial"/>
+          <w:b/>
+          <w:bCs/>
+          <w:color w:val="922B21"/>
+          <w:sz w:val="21"/>
+          <w:szCs w:val="21"/>
+        </w:rPr>
+        <w:t xml:space="preserve">Names ASSA ABLOY. Before external release, confirm client-disclosure permission or anonymize (e.g., "a building-products manufacturer"). Internal review draft only.</w:t>
       </w:r>
     </w:p>
     <w:p>

</xml_diff>

<commit_message>
docs(report): AV writing-voice pass on H1 2026 report
Catch residual AI/voice tells across all prose surfaces (manuscript,
Print HTML, interactive HTML, docx build script):
- drop "genuine" (data-center risk bullet, labor) and "precisely"
  (labor, postmortem) as connective fat
- make the data-center risk bullet a full sentence
- replace negative parallelism ("we don't pretend to have a crystal
  ball, and neither does anyone else") with a plain statement
- trim the rule-of-three "revisits the call, learns from it, and
  adjusts" to "revisits a call and adjusts when it's wrong"
- swap buzzword "unlocking layers" for "bottleneck-clearing layers"

docx + PDF regenerated.

Co-Authored-By: Claude Opus 4.8 (1M context) <noreply@anthropic.com>
</commit_message>
<xml_diff>
--- a/knowledge-base/outputs/h1-2026-prep/H1_2026_Report_DRAFT.docx
+++ b/knowledge-base/outputs/h1-2026-prep/H1_2026_Report_DRAFT.docx
@@ -47,7 +47,7 @@
         <w:spacing w:after="300"/>
         <w:jc w:val="left"/>
       </w:pPr>
-      <w:hyperlink w:history="1" r:id="rIdj6gn8luv9tdbdggjgfx4q">
+      <w:hyperlink w:history="1" r:id="rIddvjaiw27r6zvlmx41-jor">
         <w:r>
           <w:rPr>
             <w:rFonts w:ascii="Arial" w:cs="Arial" w:eastAsia="Arial" w:hAnsi="Arial"/>
@@ -1351,7 +1351,7 @@
           <w:sz w:val="24"/>
           <w:szCs w:val="24"/>
         </w:rPr>
-        <w:t xml:space="preserve">Labor remained a binding constraint on housing starts per NAHB, and workforce-development initiatives continued across the sector. But ISM Services employment turned to contraction, the first genuine loosening signal and the wage-moderation watchpoint we flagged in November.</w:t>
+        <w:t xml:space="preserve">Labor remained a binding constraint on housing starts per NAHB, and workforce-development initiatives continued across the sector. But ISM Services employment turned to contraction, the first loosening signal and the wage-moderation watchpoint we flagged in November.</w:t>
       </w:r>
     </w:p>
     <w:p>
@@ -1572,7 +1572,7 @@
           <w:sz w:val="22"/>
           <w:szCs w:val="22"/>
         </w:rPr>
-        <w:t xml:space="preserve">data-center demand is the cleanest growth opportunity in the sector, but it is gated by power, grid, permitting, and labor, not by capital. The pull-through into structural steel, concrete, electrical and power equipment, cooling, and envelope products is real, but paced by what can actually be energized. The winners are suppliers tied to the unlocking layers (power and electrical equipment, prefab, and cooling) that can plan around multi-year power and permitting timelines. It remains a concentrated bet on one capital- and power-intensive source.</w:t>
+        <w:t xml:space="preserve">data-center demand is the cleanest growth opportunity in the sector, but it is gated by power, grid, permitting, and labor, not by capital. The pull-through into structural steel, concrete, electrical and power equipment, cooling, and envelope products is real, but paced by what can actually be energized. The winners are suppliers in the bottleneck-clearing layers (power and electrical equipment, prefab, and cooling) that can plan around multi-year power and permitting timelines. It remains a concentrated bet on one capital- and power-intensive source.</w:t>
       </w:r>
     </w:p>
     <w:p>
@@ -5123,7 +5123,7 @@
           <w:sz w:val="22"/>
           <w:szCs w:val="22"/>
         </w:rPr>
-        <w:t xml:space="preserve">This candor doubles as a disclaimer. We don't pretend to have a crystal ball, and neither does anyone else forecasting this market. That is why operators benefit from an advisor who revisits the call, learns from it, and adjusts.</w:t>
+        <w:t xml:space="preserve">This candor doubles as a disclaimer. No one forecasting this market has a crystal ball. That is why operators benefit from an advisor who revisits the call and adjusts when it's wrong.</w:t>
       </w:r>
     </w:p>
     <w:p>

</xml_diff>